<commit_message>
- Fixed some icons being very choppy - setting  a custom icon in code should now work
</commit_message>
<xml_diff>
--- a/GraduationProjectVisio/Assets/Resources/7-10-2026Cocreation.docx
+++ b/GraduationProjectVisio/Assets/Resources/7-10-2026Cocreation.docx
@@ -25,13 +25,7 @@
         <w:rPr>
           <w:lang w:val="en-US"/>
         </w:rPr>
-        <w:t>Look at lesson creator</w:t>
-      </w:r>
-      <w:r>
-        <w:rPr>
-          <w:lang w:val="en-US"/>
-        </w:rPr>
-        <w:t xml:space="preserve"> (loading saves)</w:t>
+        <w:t>Look at lesson creator (loading saves)</w:t>
       </w:r>
     </w:p>
     <w:p>
@@ -81,6 +75,27 @@
         <w:t>The intention of the redesign is to make the screens more calm so there is less UI and visuals distracting the children while completing the lessons.</w:t>
       </w:r>
     </w:p>
+    <w:p>
+      <w:pPr>
+        <w:rPr>
+          <w:lang w:val="en-US"/>
+        </w:rPr>
+      </w:pPr>
+    </w:p>
+    <w:p>
+      <w:pPr>
+        <w:rPr>
+          <w:lang w:val="en-US"/>
+        </w:rPr>
+      </w:pPr>
+      <w:r>
+        <w:rPr>
+          <w:lang w:val="en-US"/>
+        </w:rPr>
+        <w:t>Readjusted buttons, Reworked the settings menu.</w:t>
+      </w:r>
+    </w:p>
+    <w:p/>
     <w:sectPr>
       <w:pgSz w:w="11906" w:h="16838"/>
       <w:pgMar w:top="1440" w:right="1440" w:bottom="1440" w:left="1440" w:header="708" w:footer="708" w:gutter="0"/>
@@ -694,7 +709,6 @@
   <w:style w:type="character" w:default="1" w:styleId="Standaardalinea-lettertype">
     <w:name w:val="Default Paragraph Font"/>
     <w:uiPriority w:val="1"/>
-    <w:semiHidden/>
     <w:unhideWhenUsed/>
   </w:style>
   <w:style w:type="table" w:default="1" w:styleId="Standaardtabel">

</xml_diff>

<commit_message>
- Tried fixing the icons a bit more so they look better - Doing setup code for the uploading of custom icons
</commit_message>
<xml_diff>
--- a/GraduationProjectVisio/Assets/Resources/7-10-2026Cocreation.docx
+++ b/GraduationProjectVisio/Assets/Resources/7-10-2026Cocreation.docx
@@ -95,7 +95,20 @@
         <w:t>Readjusted buttons, Reworked the settings menu.</w:t>
       </w:r>
     </w:p>
-    <w:p/>
+    <w:p>
+      <w:pPr>
+        <w:rPr>
+          <w:lang w:val="en-US"/>
+        </w:rPr>
+      </w:pPr>
+    </w:p>
+    <w:p>
+      <w:pPr>
+        <w:rPr>
+          <w:lang w:val="en-US"/>
+        </w:rPr>
+      </w:pPr>
+    </w:p>
     <w:sectPr>
       <w:pgSz w:w="11906" w:h="16838"/>
       <w:pgMar w:top="1440" w:right="1440" w:bottom="1440" w:left="1440" w:header="708" w:footer="708" w:gutter="0"/>

</xml_diff>